<commit_message>
chore(auto): actualizar cartas con 81 estudiantes y 63 firmas [2026-10-25 20:08]
</commit_message>
<xml_diff>
--- a/cartas_solicitud/Carta_Solicitud_ELE0300116_ELECTIVA_III_-_MARKETING_PARA_EMPRESARIOS.docx
+++ b/cartas_solicitud/Carta_Solicitud_ELE0300116_ELECTIVA_III_-_MARKETING_PARA_EMPRESARIOS.docx
@@ -3302,9 +3302,70 @@
         <w:t>Atentamente,</w:t>
         <w:br/>
         <w:br/>
-        <w:t>ESTUDIANTES SOLICITANTES DE INGENIERÍA ELÉCTRICA</w:t>
+      </w:r>
+      <w:r>
+        <w:drawing>
+          <wp:inline xmlns:a="http://schemas.openxmlformats.org/drawingml/2006/main" xmlns:pic="http://schemas.openxmlformats.org/drawingml/2006/picture">
+            <wp:extent cx="1214524" cy="438912"/>
+            <wp:docPr id="19" name="Picture 19"/>
+            <wp:cNvGraphicFramePr>
+              <a:graphicFrameLocks noChangeAspect="1"/>
+            </wp:cNvGraphicFramePr>
+            <a:graphic>
+              <a:graphicData uri="http://schemas.openxmlformats.org/drawingml/2006/picture">
+                <pic:pic>
+                  <pic:nvPicPr>
+                    <pic:cNvPr id="0" name="image.png"/>
+                    <pic:cNvPicPr/>
+                  </pic:nvPicPr>
+                  <pic:blipFill>
+                    <a:blip r:embed="rId27"/>
+                    <a:stretch>
+                      <a:fillRect/>
+                    </a:stretch>
+                  </pic:blipFill>
+                  <pic:spPr>
+                    <a:xfrm>
+                      <a:off x="0" y="0"/>
+                      <a:ext cx="1214524" cy="438912"/>
+                    </a:xfrm>
+                    <a:prstGeom prst="rect"/>
+                  </pic:spPr>
+                </pic:pic>
+              </a:graphicData>
+            </a:graphic>
+          </wp:inline>
+        </w:drawing>
+      </w:r>
+      <w:r>
+        <w:br/>
+      </w:r>
+      <w:r>
+        <w:rPr>
+          <w:b/>
+          <w:color w:val="043D1A"/>
+          <w:sz w:val="20"/>
+        </w:rPr>
+        <w:t>CARMELO SANJUANES</w:t>
+        <w:br/>
+      </w:r>
+      <w:r>
+        <w:rPr>
+          <w:color w:val="323232"/>
+          <w:sz w:val="18"/>
+        </w:rPr>
+        <w:t>Representante Estudiantil - Ingeniería Eléctrica</w:t>
         <w:br/>
         <w:t>Fundación Escuela Tecnológica de Neiva "Jesús Oviedo Pérez" - FET</w:t>
+        <w:br/>
+      </w:r>
+      <w:r>
+        <w:rPr>
+          <w:i/>
+          <w:color w:val="065F46"/>
+          <w:sz w:val="17"/>
+        </w:rPr>
+        <w:t>(Carta Oficialmente Respaldada con 18 firmas estudiantiles)</w:t>
       </w:r>
     </w:p>
     <w:sectPr>

</xml_diff>